<commit_message>
Update hardening plan doc: all 9 FRD-06/13/15 findings fixed and committed
</commit_message>
<xml_diff>
--- a/docs/GAP_ANALYSIS/Multi-Web_Hardening_Plan_FRD-06_13_15.docx
+++ b/docs/GAP_ANALYSIS/Multi-Web_Hardening_Plan_FRD-06_13_15.docx
@@ -162,18 +162,18 @@
         <w:tc>
           <w:tcPr>
             <w:tcW w:type="dxa" w:w="2000"/>
-            <w:shd w:fill="FEF3C7" w:val="clear"/>
-          </w:tcPr>
-          <w:p>
-            <w:pPr>
-              <w:jc w:val="left"/>
-            </w:pPr>
-            <w:r>
-              <w:rPr>
-                <w:b w:val="false"/>
-                <w:bCs w:val="false"/>
-              </w:rPr>
-              <w:t xml:space="preserve">Good, not perfect</w:t>
+            <w:shd w:fill="DCFCE7" w:val="clear"/>
+          </w:tcPr>
+          <w:p>
+            <w:pPr>
+              <w:jc w:val="left"/>
+            </w:pPr>
+            <w:r>
+              <w:rPr>
+                <w:b w:val="false"/>
+                <w:bCs w:val="false"/>
+              </w:rPr>
+              <w:t xml:space="preserve">Done</w:t>
             </w:r>
           </w:p>
         </w:tc>
@@ -190,7 +190,7 @@
                 <w:b w:val="false"/>
                 <w:bCs w:val="false"/>
               </w:rPr>
-              <w:t xml:space="preserve">1 High, 2 Medium, 2 Low</w:t>
+              <w:t xml:space="preserve">0 (5 fixed)</w:t>
             </w:r>
           </w:p>
         </w:tc>
@@ -207,7 +207,7 @@
                 <w:b w:val="false"/>
                 <w:bCs w:val="false"/>
               </w:rPr>
-              <w:t xml:space="preserve">~9-9.5d</w:t>
+              <w:t xml:space="preserve">0d</w:t>
             </w:r>
           </w:p>
         </w:tc>
@@ -244,7 +244,7 @@
                 <w:b w:val="false"/>
                 <w:bCs w:val="false"/>
               </w:rPr>
-              <w:t xml:space="preserve">Clean (1 gap)</w:t>
+              <w:t xml:space="preserve">Done</w:t>
             </w:r>
           </w:p>
         </w:tc>
@@ -261,7 +261,7 @@
                 <w:b w:val="false"/>
                 <w:bCs w:val="false"/>
               </w:rPr>
-              <w:t xml:space="preserve">1 Medium</w:t>
+              <w:t xml:space="preserve">0 (1 fixed)</w:t>
             </w:r>
           </w:p>
         </w:tc>
@@ -278,7 +278,7 @@
                 <w:b w:val="false"/>
                 <w:bCs w:val="false"/>
               </w:rPr>
-              <w:t xml:space="preserve">~0.5d</w:t>
+              <w:t xml:space="preserve">0d</w:t>
             </w:r>
           </w:p>
         </w:tc>
@@ -304,18 +304,18 @@
         <w:tc>
           <w:tcPr>
             <w:tcW w:type="dxa" w:w="2000"/>
-            <w:shd w:fill="FEF3C7" w:val="clear"/>
-          </w:tcPr>
-          <w:p>
-            <w:pPr>
-              <w:jc w:val="left"/>
-            </w:pPr>
-            <w:r>
-              <w:rPr>
-                <w:b w:val="false"/>
-                <w:bCs w:val="false"/>
-              </w:rPr>
-              <w:t xml:space="preserve">Clean (1 real leak)</w:t>
+            <w:shd w:fill="DCFCE7" w:val="clear"/>
+          </w:tcPr>
+          <w:p>
+            <w:pPr>
+              <w:jc w:val="left"/>
+            </w:pPr>
+            <w:r>
+              <w:rPr>
+                <w:b w:val="false"/>
+                <w:bCs w:val="false"/>
+              </w:rPr>
+              <w:t xml:space="preserve">Done</w:t>
             </w:r>
           </w:p>
         </w:tc>
@@ -332,7 +332,7 @@
                 <w:b w:val="false"/>
                 <w:bCs w:val="false"/>
               </w:rPr>
-              <w:t xml:space="preserve">1 Medium, 2 Low</w:t>
+              <w:t xml:space="preserve">0 (3 fixed)</w:t>
             </w:r>
           </w:p>
         </w:tc>
@@ -349,7 +349,7 @@
                 <w:b w:val="false"/>
                 <w:bCs w:val="false"/>
               </w:rPr>
-              <w:t xml:space="preserve">~2-2.5d</w:t>
+              <w:t xml:space="preserve">0d</w:t>
             </w:r>
           </w:p>
         </w:tc>
@@ -368,7 +368,12 @@
         <w:spacing w:after="120"/>
       </w:pPr>
       <w:r>
-        <w:t xml:space="preserve">Total effort: roughly 11.5-12.5 person-days across all three areas. No item requires schema-level rework of an already-shipped feature — every fix is additive (new reversal path, new report, new scoping guard) or a small targeted correction (one unscoped query, missing throttle middleware, one missing audit-log call).</w:t>
+        <w:rPr>
+          <w:b/>
+          <w:bCs/>
+          <w:color w:val="15803d"/>
+        </w:rPr>
+        <w:t xml:space="preserve">Total remaining effort: 0 person-days — all 9 findings across the three areas are implemented and committed.</w:t>
       </w:r>
     </w:p>
     <w:p>
@@ -390,7 +395,7 @@
           <w:iCs/>
           <w:color w:val="15803d"/>
         </w:rPr>
-        <w:t xml:space="preserve">Verdict: Good, not perfect — one High item (refund/reversal), rest is coverage and hygiene.</w:t>
+        <w:t xml:space="preserve">Verdict: Done — all 5 findings (1 High, 2 Medium, 2 Low) fixed and committed.</w:t>
       </w:r>
     </w:p>
     <w:p>
@@ -398,7 +403,7 @@
         <w:spacing w:after="120"/>
       </w:pPr>
       <w:r>
-        <w:t xml:space="preserve">Core ledger posting is sound: idempotent (checked by reference_type+reference_id before creating a transaction), transactional, and every module (Sports, Teacher Training, MCQ, membership) routes through the same FeeReceiptLedgerDispatcher — no module bypasses it. The real gap is structural: there is no way to reverse money once it's posted.</w:t>
+        <w:t xml:space="preserve">Core ledger posting is sound: idempotent (checked by reference_type+reference_id before creating a transaction), transactional, and every module (Sports, Teacher Training, MCQ, membership) routes through the same FeeReceiptLedgerDispatcher — no module bypasses it. The gap was structural: there was no way to reverse money once posted. All 5 findings are now fixed: a full refund/reversal mechanism (new "reversed" FeeReceipt status, FeeReceiptReversalService, compensating ledger entries via postReceiptReversal() wired into all four per-module ledger services, a reverse button in the Unified Payments UI), row locking on the posting transaction to close the concurrent double-approve race, a warning log when a receipt's tenant can't be resolved, MCQ fee-approval audit logging (and a redundant duplicate log call on reject removed), and a new RPT-FIN-021 fee-receipt-vs-ledger reconciliation report.</w:t>
       </w:r>
     </w:p>
     <w:tbl>
@@ -881,7 +886,7 @@
           <w:iCs/>
           <w:color w:val="15803d"/>
         </w:rPr>
-        <w:t xml:space="preserve">Verdict: Clean — 5 of 6 risk areas had zero findings; one Medium gap.</w:t>
+        <w:t xml:space="preserve">Verdict: Done — the one Medium finding is fixed.</w:t>
       </w:r>
     </w:p>
     <w:p>
@@ -889,7 +894,7 @@
         <w:spacing w:after="120"/>
       </w:pPr>
       <w:r>
-        <w:t xml:space="preserve">Authorization, mass-assignment protection, file-upload validation, and audit-log coverage on all newer controllers (BoardResultVerificationController, TrainingResourcePersonController, TeacherMcqRegistrationController, the public portal/certificate controllers) checked clean. The one gap is missing rate limiting on public, unauthenticated endpoints that are enumerable by UUID.</w:t>
+        <w:t xml:space="preserve">Authorization, mass-assignment protection, file-upload validation, and audit-log coverage on all newer controllers (BoardResultVerificationController, TrainingResourcePersonController, TeacherMcqRegistrationController, the public portal/certificate controllers) checked clean. The one gap — missing rate limiting on public, unauthenticated, UUID-enumerable endpoints — is fixed: throttle:60,1 added to /verify/{uuid}, /certificates/verify/{uuid}, /certificates/print/{uuid}, and the academic-results public portal route group.</w:t>
       </w:r>
     </w:p>
     <w:tbl>
@@ -1084,7 +1089,7 @@
           <w:iCs/>
           <w:color w:val="15803d"/>
         </w:rPr>
-        <w:t xml:space="preserve">Verdict: Clean except one real cross-tenant leak in an award-computation query.</w:t>
+        <w:t xml:space="preserve">Verdict: Done — the real cross-tenant leak and both hygiene findings are fixed.</w:t>
       </w:r>
     </w:p>
     <w:p>
@@ -1092,7 +1097,7 @@
         <w:spacing w:after="120"/>
       </w:pPr>
       <w:r>
-        <w:t xml:space="preserve">Tenant scoping across newer Academic Results and Training tables is enforced consistently at the service layer (no model uses a global scope, matching the existing BoardResult/Topper convention, but every read/write path checked passes the tenant filter explicitly) — except one query. StateAdmin cross-tenant reads are correctly gated behind a genuinely separate state.admin role and return aggregate-only data.</w:t>
+        <w:t xml:space="preserve">Tenant scoping across newer Academic Results and Training tables is enforced consistently at the service layer (no model uses a global scope, matching the existing BoardResult/Topper convention, but every read/write path checked passes the tenant filter explicitly) — except one query, now fixed: AwardsEngine::awardBestStreamSchool() switched to the existing ExamStream::forSahodaya() scope. StateAdmin cross-tenant reads remain correctly gated behind a genuinely separate state.admin role with aggregate-only output. Defense-in-depth: a new ScopesBySahodaya trait was applied to 6 newer models (AcademicAward, AcademicPerformanceScore, ApiConfig, BoardResultRanking, TopperCountConfig, TopperSubjectMark), and TopperSubjectMark additionally got a real denormalized tenant_id column with a backfill migration, closing the one model that previously had no direct tenant column at all.</w:t>
       </w:r>
     </w:p>
     <w:tbl>
@@ -1418,7 +1423,7 @@
         <w:spacing w:after="150" w:before="300"/>
       </w:pPr>
       <w:r>
-        <w:t xml:space="preserve">Suggested Order</w:t>
+        <w:t xml:space="preserve">Status</w:t>
       </w:r>
     </w:p>
     <w:p>
@@ -1426,85 +1431,7 @@
         <w:spacing w:after="120"/>
       </w:pPr>
       <w:r>
-        <w:t xml:space="preserve">Priority is risk-weighted, not by module — fix the real leak and the money-reversal gap first, then the smaller hygiene items in any order.</w:t>
-      </w:r>
-    </w:p>
-    <w:p>
-      <w:pPr>
-        <w:pStyle w:val="ListParagraph"/>
-        <w:numPr>
-          <w:ilvl w:val="0"/>
-          <w:numId w:val="2"/>
-        </w:numPr>
-        <w:spacing w:after="60"/>
-      </w:pPr>
-      <w:r>
-        <w:t xml:space="preserve">1. FRD-13 #1 — ExamStream sahodaya-scoping fix (0.5d): the only confirmed cross-tenant data leak found across all three areas.</w:t>
-      </w:r>
-    </w:p>
-    <w:p>
-      <w:pPr>
-        <w:pStyle w:val="ListParagraph"/>
-        <w:numPr>
-          <w:ilvl w:val="0"/>
-          <w:numId w:val="2"/>
-        </w:numPr>
-        <w:spacing w:after="60"/>
-      </w:pPr>
-      <w:r>
-        <w:t xml:space="preserve">2. FRD-06 #1 — Refund/reversal mechanism (5-6d): the only High-severity item and the largest effort; blocks any real-world chargeback/cancellation handling today.</w:t>
-      </w:r>
-    </w:p>
-    <w:p>
-      <w:pPr>
-        <w:pStyle w:val="ListParagraph"/>
-        <w:numPr>
-          <w:ilvl w:val="0"/>
-          <w:numId w:val="2"/>
-        </w:numPr>
-        <w:spacing w:after="60"/>
-      </w:pPr>
-      <w:r>
-        <w:t xml:space="preserve">3. FRD-15 #1 — Rate limiting on public endpoints (0.5d): quick, closes an enumeration/scraping gap.</w:t>
-      </w:r>
-    </w:p>
-    <w:p>
-      <w:pPr>
-        <w:pStyle w:val="ListParagraph"/>
-        <w:numPr>
-          <w:ilvl w:val="0"/>
-          <w:numId w:val="2"/>
-        </w:numPr>
-        <w:spacing w:after="60"/>
-      </w:pPr>
-      <w:r>
-        <w:t xml:space="preserve">4. FRD-06 #3 — MCQ approval audit logging (0.5d): quick, closes an audit-trail asymmetry.</w:t>
-      </w:r>
-    </w:p>
-    <w:p>
-      <w:pPr>
-        <w:pStyle w:val="ListParagraph"/>
-        <w:numPr>
-          <w:ilvl w:val="0"/>
-          <w:numId w:val="2"/>
-        </w:numPr>
-        <w:spacing w:after="60"/>
-      </w:pPr>
-      <w:r>
-        <w:t xml:space="preserve">5. FRD-06 #2 — Reconciliation report (2d): safety net for the reversal work above and for catching future drift.</w:t>
-      </w:r>
-    </w:p>
-    <w:p>
-      <w:pPr>
-        <w:pStyle w:val="ListParagraph"/>
-        <w:numPr>
-          <w:ilvl w:val="0"/>
-          <w:numId w:val="2"/>
-        </w:numPr>
-        <w:spacing w:after="60"/>
-      </w:pPr>
-      <w:r>
-        <w:t xml:space="preserve">6. FRD-13 #2, #3 and FRD-06 #4, #5 — remaining Low-severity hygiene items (~2.5-3d total), any order.</w:t>
+        <w:t xml:space="preserve">All 9 findings across FRD-06, FRD-13, and FRD-15 are implemented, syntax-verified, and committed. No further action is pending in this hardening plan.</w:t>
       </w:r>
     </w:p>
     <w:sectPr>
@@ -1695,12 +1622,6 @@
   </w:abstractNum>
   <w:num w:numId="1">
     <w:abstractNumId w:val="1"/>
-    <w:lvlOverride w:ilvl="0">
-      <w:startOverride w:val="1"/>
-    </w:lvlOverride>
-  </w:num>
-  <w:num w:numId="2">
-    <w:abstractNumId w:val="2"/>
     <w:lvlOverride w:ilvl="0">
       <w:startOverride w:val="1"/>
     </w:lvlOverride>

</xml_diff>